<commit_message>
new file:   .~lock.dbmsSyl.docx# 	modified:   backend/app/api/routes.py 	modified:   dbmsSyl.docx
</commit_message>
<xml_diff>
--- a/dbmsSyl.docx
+++ b/dbmsSyl.docx
@@ -36,6 +36,7 @@
       <w:pgNumType w:fmt="decimal"/>
       <w:formProt w:val="false"/>
       <w:textDirection w:val="lrTb"/>
+      <w:docGrid w:type="default" w:linePitch="100" w:charSpace="0"/>
     </w:sectPr>
   </w:body>
 </w:document>
@@ -55,7 +56,6 @@
     </w:rPrDefault>
     <w:pPrDefault>
       <w:pPr>
-        <w:widowControl/>
         <w:suppressAutoHyphens w:val="true"/>
       </w:pPr>
     </w:pPrDefault>
@@ -65,7 +65,10 @@
     <w:qFormat/>
     <w:pPr>
       <w:widowControl/>
+      <w:suppressAutoHyphens w:val="true"/>
       <w:bidi w:val="0"/>
+      <w:spacing w:before="0" w:after="0"/>
+      <w:jc w:val="start"/>
     </w:pPr>
     <w:rPr>
       <w:rFonts w:ascii="Liberation Serif" w:hAnsi="Liberation Serif" w:eastAsia="Noto Serif CJK SC" w:cs="Liberation Sans"/>

</xml_diff>

<commit_message>
modified:   .~lock.dbmsSyl.docx# 	modified:   backend/requirements.txt 	modified:   dbmsSyl.docx
</commit_message>
<xml_diff>
--- a/dbmsSyl.docx
+++ b/dbmsSyl.docx
@@ -15,18 +15,6 @@
         <w:br/>
         <w:br/>
         <w:t>Unit 1: Introduction</w:t>
-      </w:r>
-    </w:p>
-    <w:p>
-      <w:pPr>
-        <w:pStyle w:val="Normal"/>
-        <w:bidi w:val="0"/>
-        <w:jc w:val="start"/>
-        <w:rPr/>
-      </w:pPr>
-      <w:r>
-        <w:rPr/>
-        <w:t>Unit 2: Nested Queries</w:t>
       </w:r>
     </w:p>
     <w:sectPr>

</xml_diff>